<commit_message>
docs: document dashboard routing and statistics features
</commit_message>
<xml_diff>
--- a/docs/documentation.docx
+++ b/docs/documentation.docx
@@ -177,7 +177,7 @@
     </w:p>
     <w:sdt>
       <w:sdtPr>
-        <w:id w:val="-252391252"/>
+        <w:id w:val="-23899407"/>
         <w:docPartObj>
           <w:docPartGallery w:val="Table of Contents"/>
           <w:docPartUnique w:val="1"/>
@@ -1876,13 +1876,32 @@
             </w:pPr>
             <w:r>
               <w:rPr>
+                <w:rFonts w:ascii="Roboto Mono" w:cs="Roboto Mono" w:eastAsia="Roboto Mono" w:hAnsi="Roboto Mono"/>
+                <w:color w:val="188038"/>
+                <w:sz w:val="20"/>
+                <w:szCs w:val="20"/>
+                <w:rtl w:val="0"/>
+              </w:rPr>
+              <w:t xml:space="preserve">raw_hourly_readings</w:t>
+            </w:r>
+            <w:r>
+              <w:rPr>
+                <w:rFonts w:ascii="Roboto Mono" w:cs="Roboto Mono" w:eastAsia="Roboto Mono" w:hAnsi="Roboto Mono"/>
+                <w:sz w:val="20"/>
+                <w:szCs w:val="20"/>
+                <w:rtl w:val="0"/>
+              </w:rPr>
+              <w:t xml:space="preserve"> </w:t>
+            </w:r>
+            <w:r>
+              <w:rPr>
                 <w:b w:val="0"/>
                 <w:bCs w:val="0"/>
                 <w:sz w:val="20"/>
                 <w:szCs w:val="20"/>
                 <w:rtl w:val="0"/>
               </w:rPr>
-              <w:t xml:space="preserve">raw_hourly_readings (Feature Store)</w:t>
+              <w:t xml:space="preserve">(Feature Store)</w:t>
             </w:r>
             <w:r>
               <w:rPr>
@@ -2002,13 +2021,23 @@
             </w:pPr>
             <w:r>
               <w:rPr>
+                <w:rFonts w:ascii="Roboto Mono" w:cs="Roboto Mono" w:eastAsia="Roboto Mono" w:hAnsi="Roboto Mono"/>
+                <w:color w:val="188038"/>
+                <w:sz w:val="20"/>
+                <w:szCs w:val="20"/>
+                <w:rtl w:val="0"/>
+              </w:rPr>
+              <w:t xml:space="preserve">daily_engineered_features</w:t>
+            </w:r>
+            <w:r>
+              <w:rPr>
                 <w:b w:val="0"/>
                 <w:bCs w:val="0"/>
                 <w:sz w:val="20"/>
                 <w:szCs w:val="20"/>
                 <w:rtl w:val="0"/>
               </w:rPr>
-              <w:t xml:space="preserve">daily_engineered_features (Feature Store)</w:t>
+              <w:t xml:space="preserve"> (Feature Store)</w:t>
             </w:r>
             <w:r>
               <w:rPr>
@@ -2124,8 +2153,21 @@
           </w:tcPr>
           <w:p>
             <w:pPr>
-              <w:rPr/>
+              <w:rPr>
+                <w:rFonts w:ascii="Roboto Mono" w:cs="Roboto Mono" w:eastAsia="Roboto Mono" w:hAnsi="Roboto Mono"/>
+                <w:color w:val="188038"/>
+              </w:rPr>
             </w:pPr>
+            <w:r>
+              <w:rPr>
+                <w:rFonts w:ascii="Roboto Mono" w:cs="Roboto Mono" w:eastAsia="Roboto Mono" w:hAnsi="Roboto Mono"/>
+                <w:color w:val="188038"/>
+                <w:sz w:val="20"/>
+                <w:szCs w:val="20"/>
+                <w:rtl w:val="0"/>
+              </w:rPr>
+              <w:t xml:space="preserve">raw_hourly_readings</w:t>
+            </w:r>
             <w:r>
               <w:rPr>
                 <w:b w:val="0"/>
@@ -2134,7 +2176,17 @@
                 <w:szCs w:val="20"/>
                 <w:rtl w:val="0"/>
               </w:rPr>
-              <w:t xml:space="preserve">raw_hourly_readings / daily_engineered_features</w:t>
+              <w:t xml:space="preserve"> / </w:t>
+            </w:r>
+            <w:r>
+              <w:rPr>
+                <w:rFonts w:ascii="Roboto Mono" w:cs="Roboto Mono" w:eastAsia="Roboto Mono" w:hAnsi="Roboto Mono"/>
+                <w:color w:val="188038"/>
+                <w:sz w:val="20"/>
+                <w:szCs w:val="20"/>
+                <w:rtl w:val="0"/>
+              </w:rPr>
+              <w:t xml:space="preserve">daily_engineered_features</w:t>
             </w:r>
             <w:r>
               <w:rPr>
@@ -2220,12 +2272,15 @@
           </w:tcPr>
           <w:p>
             <w:pPr>
-              <w:rPr/>
+              <w:rPr>
+                <w:rFonts w:ascii="Roboto Mono" w:cs="Roboto Mono" w:eastAsia="Roboto Mono" w:hAnsi="Roboto Mono"/>
+                <w:color w:val="188038"/>
+              </w:rPr>
             </w:pPr>
             <w:r>
               <w:rPr>
-                <w:b w:val="0"/>
-                <w:bCs w:val="0"/>
+                <w:rFonts w:ascii="Roboto Mono" w:cs="Roboto Mono" w:eastAsia="Roboto Mono" w:hAnsi="Roboto Mono"/>
+                <w:color w:val="188038"/>
                 <w:sz w:val="20"/>
                 <w:szCs w:val="20"/>
                 <w:rtl w:val="0"/>
@@ -2346,7 +2401,10 @@
           </w:tcPr>
           <w:p>
             <w:pPr>
-              <w:rPr/>
+              <w:rPr>
+                <w:rFonts w:ascii="Roboto Mono" w:cs="Roboto Mono" w:eastAsia="Roboto Mono" w:hAnsi="Roboto Mono"/>
+                <w:color w:val="188038"/>
+              </w:rPr>
             </w:pPr>
             <w:r>
               <w:rPr>
@@ -2356,7 +2414,17 @@
                 <w:szCs w:val="20"/>
                 <w:rtl w:val="0"/>
               </w:rPr>
-              <w:t xml:space="preserve">Model Registry, daily_engineered_features</w:t>
+              <w:t xml:space="preserve">Model Registry, </w:t>
+            </w:r>
+            <w:r>
+              <w:rPr>
+                <w:rFonts w:ascii="Roboto Mono" w:cs="Roboto Mono" w:eastAsia="Roboto Mono" w:hAnsi="Roboto Mono"/>
+                <w:color w:val="188038"/>
+                <w:sz w:val="20"/>
+                <w:szCs w:val="20"/>
+                <w:rtl w:val="0"/>
+              </w:rPr>
+              <w:t xml:space="preserve">daily_engineered_features</w:t>
             </w:r>
             <w:r>
               <w:rPr>
@@ -2648,6 +2716,37 @@
       </w:pPr>
       <w:r>
         <w:rPr>
+          <w:rFonts w:ascii="Roboto Mono" w:cs="Roboto Mono" w:eastAsia="Roboto Mono" w:hAnsi="Roboto Mono"/>
+          <w:color w:val="188038"/>
+          <w:rtl w:val="0"/>
+        </w:rPr>
+        <w:t xml:space="preserve">r</w:t>
+      </w:r>
+      <w:r>
+        <w:rPr>
+          <w:rFonts w:ascii="Roboto Mono" w:cs="Roboto Mono" w:eastAsia="Roboto Mono" w:hAnsi="Roboto Mono"/>
+          <w:i w:val="0"/>
+          <w:iCs w:val="0"/>
+          <w:smallCaps w:val="0"/>
+          <w:strike w:val="0"/>
+          <w:color w:val="188038"/>
+          <w:sz w:val="22"/>
+          <w:szCs w:val="22"/>
+          <w:u w:val="none"/>
+          <w:shd w:fill="auto" w:val="clear"/>
+          <w:vertAlign w:val="baseline"/>
+          <w:rtl w:val="0"/>
+        </w:rPr>
+        <w:t xml:space="preserve">aw_hourly_readings</w:t>
+      </w:r>
+      <w:r>
+        <w:rPr>
+          <w:rtl w:val="0"/>
+        </w:rPr>
+        <w:t xml:space="preserve"> </w:t>
+      </w:r>
+      <w:r>
+        <w:rPr>
           <w:rFonts w:ascii="Calibri" w:cs="Calibri" w:eastAsia="Calibri" w:hAnsi="Calibri"/>
           <w:b w:val="0"/>
           <w:bCs w:val="0"/>
@@ -2663,7 +2762,7 @@
           <w:vertAlign w:val="baseline"/>
           <w:rtl w:val="0"/>
         </w:rPr>
-        <w:t xml:space="preserve">raw_hourly_readings — one row per hour, untouched pollutant and weather values, the permanent historical record.</w:t>
+        <w:t xml:space="preserve">— one row per hour, untouched pollutant and weather values, the permanent historical record.</w:t>
       </w:r>
     </w:p>
     <w:p>
@@ -2691,6 +2790,39 @@
       </w:pPr>
       <w:r>
         <w:rPr>
+          <w:rFonts w:ascii="Roboto Mono" w:cs="Roboto Mono" w:eastAsia="Roboto Mono" w:hAnsi="Roboto Mono"/>
+          <w:i w:val="0"/>
+          <w:iCs w:val="0"/>
+          <w:smallCaps w:val="0"/>
+          <w:strike w:val="0"/>
+          <w:color w:val="188038"/>
+          <w:sz w:val="22"/>
+          <w:szCs w:val="22"/>
+          <w:u w:val="none"/>
+          <w:shd w:fill="auto" w:val="clear"/>
+          <w:vertAlign w:val="baseline"/>
+          <w:rtl w:val="0"/>
+        </w:rPr>
+        <w:t xml:space="preserve">daily_engineered_features</w:t>
+      </w:r>
+      <w:r>
+        <w:rPr>
+          <w:i w:val="0"/>
+          <w:iCs w:val="0"/>
+          <w:smallCaps w:val="0"/>
+          <w:strike w:val="0"/>
+          <w:color w:val="000000"/>
+          <w:sz w:val="22"/>
+          <w:szCs w:val="22"/>
+          <w:u w:val="none"/>
+          <w:shd w:fill="auto" w:val="clear"/>
+          <w:vertAlign w:val="baseline"/>
+          <w:rtl w:val="0"/>
+        </w:rPr>
+        <w:t xml:space="preserve"> </w:t>
+      </w:r>
+      <w:r>
+        <w:rPr>
           <w:rFonts w:ascii="Calibri" w:cs="Calibri" w:eastAsia="Calibri" w:hAnsi="Calibri"/>
           <w:b w:val="0"/>
           <w:bCs w:val="0"/>
@@ -2706,7 +2838,7 @@
           <w:vertAlign w:val="baseline"/>
           <w:rtl w:val="0"/>
         </w:rPr>
-        <w:t xml:space="preserve">daily_engineered_features — one row per day, built by aggregating the prior 7 days of raw hourly data into lag features, 3- and 7-day rolling statistics, and calendar features. This is what the training and inference pipelines actually consume.</w:t>
+        <w:t xml:space="preserve">— one row per day, built by aggregating the prior 7 days of raw hourly data into lag features, 3- and 7-day rolling statistics, and calendar features. This is what the training and inference pipelines actually consume.</w:t>
       </w:r>
     </w:p>
     <w:p>
@@ -2755,7 +2887,7 @@
         <w:rPr>
           <w:rtl w:val="0"/>
         </w:rPr>
-        <w:t xml:space="preserve">Weather features were tested and rejected outright — they did not improve validation metrics even after RFECV-guided reduction. Calendar features were tested and accepted, with RFECV reducing the group down to a single feature, month, which did improve validation performance. The resulting final set locked in 23 features, down from the original 49.</w:t>
+        <w:t xml:space="preserve">Weather features were tested and rejected outright — they did not improve validation metrics even after RFECV-guided reduction. Calendar features were tested and accepted, with RFECV reducing the group down to a single feature, month, which did improve validation performance. The resulting final set is locked in 23 features, down from the original 49.</w:t>
       </w:r>
     </w:p>
     <w:p>
@@ -2780,7 +2912,68 @@
         <w:rPr>
           <w:rtl w:val="0"/>
         </w:rPr>
-        <w:t xml:space="preserve">A feature distribution analysis on the 23 selected features found wide variation in scale (for example, month has a range of 11, while co_today's range exceeds 7,500), and most features were right-skewed, with several strongly so. This skew was treated as genuine data character rather than an artifact to correct. RobustScaler was selected for Ridge Regression and the Dense Neural Network, chosen specifically for its reduced sensitivity to skew and outliers; Random Forest used raw, unscaled values. A log1p transform was applied ahead of scaling to the most heavily skewed features: co_today and the PM2.5/PM10 rolling standard deviation features.</w:t>
+        <w:t xml:space="preserve">A feature distribution analysis on the 23 selected features found wide variation in scale (for example, </w:t>
+      </w:r>
+      <w:r>
+        <w:rPr>
+          <w:rFonts w:ascii="Roboto Mono" w:cs="Roboto Mono" w:eastAsia="Roboto Mono" w:hAnsi="Roboto Mono"/>
+          <w:color w:val="188038"/>
+          <w:rtl w:val="0"/>
+        </w:rPr>
+        <w:t xml:space="preserve">month</w:t>
+      </w:r>
+      <w:r>
+        <w:rPr>
+          <w:rtl w:val="0"/>
+        </w:rPr>
+        <w:t xml:space="preserve"> </w:t>
+      </w:r>
+      <w:r>
+        <w:rPr>
+          <w:rtl w:val="0"/>
+        </w:rPr>
+        <w:t xml:space="preserve">has a range of 11, while </w:t>
+      </w:r>
+      <w:r>
+        <w:rPr>
+          <w:rFonts w:ascii="Roboto Mono" w:cs="Roboto Mono" w:eastAsia="Roboto Mono" w:hAnsi="Roboto Mono"/>
+          <w:color w:val="188038"/>
+          <w:rtl w:val="0"/>
+        </w:rPr>
+        <w:t xml:space="preserve">co_today</w:t>
+      </w:r>
+      <w:r>
+        <w:rPr>
+          <w:rtl w:val="0"/>
+        </w:rPr>
+        <w:t xml:space="preserve">'s</w:t>
+      </w:r>
+      <w:r>
+        <w:rPr>
+          <w:rFonts w:ascii="Roboto Mono" w:cs="Roboto Mono" w:eastAsia="Roboto Mono" w:hAnsi="Roboto Mono"/>
+          <w:rtl w:val="0"/>
+        </w:rPr>
+        <w:t xml:space="preserve"> </w:t>
+      </w:r>
+      <w:r>
+        <w:rPr>
+          <w:rtl w:val="0"/>
+        </w:rPr>
+        <w:t xml:space="preserve">range exceeds 7,500), and most features were right-skewed, with several strongly so. This skew was treated as genuine data character rather than an artifact to correct. RobustScaler was selected for Ridge Regression and the Dense Neural Network, chosen specifically for its reduced sensitivity to skew and outliers; Random Forest used raw, unscaled values. A log1p transform was applied ahead of scaling to the most heavily skewed features: </w:t>
+      </w:r>
+      <w:r>
+        <w:rPr>
+          <w:rFonts w:ascii="Roboto Mono" w:cs="Roboto Mono" w:eastAsia="Roboto Mono" w:hAnsi="Roboto Mono"/>
+          <w:color w:val="188038"/>
+          <w:rtl w:val="0"/>
+        </w:rPr>
+        <w:t xml:space="preserve">co_today </w:t>
+      </w:r>
+      <w:r>
+        <w:rPr>
+          <w:rtl w:val="0"/>
+        </w:rPr>
+        <w:t xml:space="preserve">and the PM2.5/PM10 rolling standard deviation features.</w:t>
       </w:r>
     </w:p>
     <w:p>
@@ -4017,7 +4210,21 @@
         <w:rPr>
           <w:rtl w:val="0"/>
         </w:rPr>
-        <w:t xml:space="preserve">SHAP (SHapley Additive exPlanations) was used to explain each of the four per-horizon MLP models, via `shap.DeepExplainer` with a 100-sample background set drawn from training data. For each model, a beeswarm plot, a bar plot and a waterfall plot of mean absolute SHAP values were generated.</w:t>
+        <w:t xml:space="preserve">SHAP (SHapley Additive exPlanations) was used to explain each of the four per-horizon MLP models, via </w:t>
+      </w:r>
+      <w:r>
+        <w:rPr>
+          <w:rFonts w:ascii="Roboto Mono" w:cs="Roboto Mono" w:eastAsia="Roboto Mono" w:hAnsi="Roboto Mono"/>
+          <w:color w:val="188038"/>
+          <w:rtl w:val="0"/>
+        </w:rPr>
+        <w:t xml:space="preserve">shap.DeepExplainer</w:t>
+      </w:r>
+      <w:r>
+        <w:rPr>
+          <w:rtl w:val="0"/>
+        </w:rPr>
+        <w:t xml:space="preserve"> with a 100-sample background set drawn from training data. For each model, a beeswarm plot, a bar plot and a waterfall plot of mean absolute SHAP values were generated.</w:t>
       </w:r>
     </w:p>
     <w:p>
@@ -4035,9 +4242,51 @@
       </w:r>
       <w:r>
         <w:rPr>
-          <w:rtl w:val="0"/>
-        </w:rPr>
-        <w:t xml:space="preserve">pm25_today is the dominant driver by a clear margin; pm25_roll_mean_3, pm10_today, and select AQI/PM2.5 lag features are secondary; weather and minor gas features have limited impact.</w:t>
+          <w:rFonts w:ascii="Roboto Mono" w:cs="Roboto Mono" w:eastAsia="Roboto Mono" w:hAnsi="Roboto Mono"/>
+          <w:color w:val="188038"/>
+          <w:rtl w:val="0"/>
+        </w:rPr>
+        <w:t xml:space="preserve">pm25_today</w:t>
+      </w:r>
+      <w:r>
+        <w:rPr>
+          <w:rtl w:val="0"/>
+        </w:rPr>
+        <w:t xml:space="preserve"> </w:t>
+      </w:r>
+      <w:r>
+        <w:rPr>
+          <w:rtl w:val="0"/>
+        </w:rPr>
+        <w:t xml:space="preserve">is the dominant driver by a clear margin; </w:t>
+      </w:r>
+      <w:r>
+        <w:rPr>
+          <w:rFonts w:ascii="Roboto Mono" w:cs="Roboto Mono" w:eastAsia="Roboto Mono" w:hAnsi="Roboto Mono"/>
+          <w:color w:val="188038"/>
+          <w:rtl w:val="0"/>
+        </w:rPr>
+        <w:t xml:space="preserve">pm25_roll_mean_3</w:t>
+      </w:r>
+      <w:r>
+        <w:rPr>
+          <w:rtl w:val="0"/>
+        </w:rPr>
+        <w:t xml:space="preserve">, </w:t>
+      </w:r>
+      <w:r>
+        <w:rPr>
+          <w:rFonts w:ascii="Roboto Mono" w:cs="Roboto Mono" w:eastAsia="Roboto Mono" w:hAnsi="Roboto Mono"/>
+          <w:color w:val="188038"/>
+          <w:rtl w:val="0"/>
+        </w:rPr>
+        <w:t xml:space="preserve">pm10_today</w:t>
+      </w:r>
+      <w:r>
+        <w:rPr>
+          <w:rtl w:val="0"/>
+        </w:rPr>
+        <w:t xml:space="preserve">, and select AQI/PM2.5 lag features are secondary; weather and minor gas features have limited impact.</w:t>
       </w:r>
     </w:p>
     <w:p>
@@ -4055,9 +4304,113 @@
       </w:r>
       <w:r>
         <w:rPr>
-          <w:rtl w:val="0"/>
-        </w:rPr>
-        <w:t xml:space="preserve">pm25_today and pm25_roll_mean_7 dominate (mean |SHAP| ≈19.5 and ≈13.8); aqi_today, co_today, aqi_lag_1, and o3_today form the secondary tier.</w:t>
+          <w:rFonts w:ascii="Roboto Mono" w:cs="Roboto Mono" w:eastAsia="Roboto Mono" w:hAnsi="Roboto Mono"/>
+          <w:color w:val="188038"/>
+          <w:rtl w:val="0"/>
+        </w:rPr>
+        <w:t xml:space="preserve">pm25_today</w:t>
+      </w:r>
+      <w:r>
+        <w:rPr>
+          <w:rtl w:val="0"/>
+        </w:rPr>
+        <w:t xml:space="preserve"> </w:t>
+      </w:r>
+      <w:r>
+        <w:rPr>
+          <w:rtl w:val="0"/>
+        </w:rPr>
+        <w:t xml:space="preserve">and </w:t>
+      </w:r>
+      <w:r>
+        <w:rPr>
+          <w:rFonts w:ascii="Roboto Mono" w:cs="Roboto Mono" w:eastAsia="Roboto Mono" w:hAnsi="Roboto Mono"/>
+          <w:color w:val="188038"/>
+          <w:rtl w:val="0"/>
+        </w:rPr>
+        <w:t xml:space="preserve">pm25_roll_mean_7</w:t>
+      </w:r>
+      <w:r>
+        <w:rPr>
+          <w:rtl w:val="0"/>
+        </w:rPr>
+        <w:t xml:space="preserve"> </w:t>
+      </w:r>
+      <w:r>
+        <w:rPr>
+          <w:rtl w:val="0"/>
+        </w:rPr>
+        <w:t xml:space="preserve">dominate (mean |SHAP| ≈19.5 and ≈13.8); </w:t>
+      </w:r>
+      <w:r>
+        <w:rPr>
+          <w:rFonts w:ascii="Roboto Mono" w:cs="Roboto Mono" w:eastAsia="Roboto Mono" w:hAnsi="Roboto Mono"/>
+          <w:color w:val="188038"/>
+          <w:rtl w:val="0"/>
+        </w:rPr>
+        <w:t xml:space="preserve">aqi_today</w:t>
+      </w:r>
+      <w:r>
+        <w:rPr>
+          <w:rtl w:val="0"/>
+        </w:rPr>
+        <w:t xml:space="preserve">, </w:t>
+      </w:r>
+      <w:r>
+        <w:rPr>
+          <w:rFonts w:ascii="Roboto Mono" w:cs="Roboto Mono" w:eastAsia="Roboto Mono" w:hAnsi="Roboto Mono"/>
+          <w:color w:val="188038"/>
+          <w:rtl w:val="0"/>
+        </w:rPr>
+        <w:t xml:space="preserve">co_today</w:t>
+      </w:r>
+      <w:r>
+        <w:rPr>
+          <w:rtl w:val="0"/>
+        </w:rPr>
+        <w:t xml:space="preserve">,</w:t>
+      </w:r>
+      <w:r>
+        <w:rPr>
+          <w:rFonts w:ascii="Roboto" w:cs="Roboto" w:eastAsia="Roboto" w:hAnsi="Roboto"/>
+          <w:color w:val="188038"/>
+          <w:rtl w:val="0"/>
+        </w:rPr>
+        <w:t xml:space="preserve"> </w:t>
+      </w:r>
+      <w:r>
+        <w:rPr>
+          <w:rFonts w:ascii="Roboto Mono" w:cs="Roboto Mono" w:eastAsia="Roboto Mono" w:hAnsi="Roboto Mono"/>
+          <w:color w:val="188038"/>
+          <w:rtl w:val="0"/>
+        </w:rPr>
+        <w:t xml:space="preserve">aqi_lag_1</w:t>
+      </w:r>
+      <w:r>
+        <w:rPr>
+          <w:rtl w:val="0"/>
+        </w:rPr>
+        <w:t xml:space="preserve">, and </w:t>
+      </w:r>
+      <w:r>
+        <w:rPr>
+          <w:rFonts w:ascii="Roboto Mono" w:cs="Roboto Mono" w:eastAsia="Roboto Mono" w:hAnsi="Roboto Mono"/>
+          <w:color w:val="188038"/>
+          <w:rtl w:val="0"/>
+        </w:rPr>
+        <w:t xml:space="preserve">o3_today</w:t>
+      </w:r>
+      <w:r>
+        <w:rPr>
+          <w:rtl w:val="0"/>
+        </w:rPr>
+        <w:t xml:space="preserve"> </w:t>
+      </w:r>
+      <w:r>
+        <w:rPr>
+          <w:rtl w:val="0"/>
+        </w:rPr>
+        <w:t xml:space="preserve">form the secondary tier.</w:t>
       </w:r>
     </w:p>
     <w:p>
@@ -4075,9 +4428,63 @@
       </w:r>
       <w:r>
         <w:rPr>
-          <w:rtl w:val="0"/>
-        </w:rPr>
-        <w:t xml:space="preserve">pm25_roll_mean_7 (≈18.8) and pm25_today (≈14.3) lead, followed by aqi_today (≈11.2); several AQI/PM10 lag features show inverse relationships.</w:t>
+          <w:rFonts w:ascii="Roboto Mono" w:cs="Roboto Mono" w:eastAsia="Roboto Mono" w:hAnsi="Roboto Mono"/>
+          <w:color w:val="188038"/>
+          <w:rtl w:val="0"/>
+        </w:rPr>
+        <w:t xml:space="preserve">pm25_roll_mean_7</w:t>
+      </w:r>
+      <w:r>
+        <w:rPr>
+          <w:rtl w:val="0"/>
+        </w:rPr>
+        <w:t xml:space="preserve"> </w:t>
+      </w:r>
+      <w:r>
+        <w:rPr>
+          <w:rtl w:val="0"/>
+        </w:rPr>
+        <w:t xml:space="preserve">(≈18.8) and </w:t>
+      </w:r>
+      <w:r>
+        <w:rPr>
+          <w:rFonts w:ascii="Roboto Mono" w:cs="Roboto Mono" w:eastAsia="Roboto Mono" w:hAnsi="Roboto Mono"/>
+          <w:color w:val="188038"/>
+          <w:rtl w:val="0"/>
+        </w:rPr>
+        <w:t xml:space="preserve">pm25_today</w:t>
+      </w:r>
+      <w:r>
+        <w:rPr>
+          <w:rtl w:val="0"/>
+        </w:rPr>
+        <w:t xml:space="preserve"> </w:t>
+      </w:r>
+      <w:r>
+        <w:rPr>
+          <w:rtl w:val="0"/>
+        </w:rPr>
+        <w:t xml:space="preserve">(≈14.3) lead, followed by </w:t>
+      </w:r>
+      <w:r>
+        <w:rPr>
+          <w:rFonts w:ascii="Roboto Mono" w:cs="Roboto Mono" w:eastAsia="Roboto Mono" w:hAnsi="Roboto Mono"/>
+          <w:color w:val="188038"/>
+          <w:rtl w:val="0"/>
+        </w:rPr>
+        <w:t xml:space="preserve">aqi_today</w:t>
+      </w:r>
+      <w:r>
+        <w:rPr>
+          <w:rtl w:val="0"/>
+        </w:rPr>
+        <w:t xml:space="preserve"> </w:t>
+      </w:r>
+      <w:r>
+        <w:rPr>
+          <w:rtl w:val="0"/>
+        </w:rPr>
+        <w:t xml:space="preserve">(≈11.2); several AQI/PM10 lag features show inverse relationships.</w:t>
       </w:r>
     </w:p>
     <w:p>
@@ -4095,9 +4502,83 @@
       </w:r>
       <w:r>
         <w:rPr>
-          <w:rtl w:val="0"/>
-        </w:rPr>
-        <w:t xml:space="preserve">pm25_roll_mean_7 (≈14.8) and aqi_today (≈9.0) dominate; pm25_lag_2 and pm10_roll_mean_7 form the next tier.</w:t>
+          <w:rFonts w:ascii="Roboto Mono" w:cs="Roboto Mono" w:eastAsia="Roboto Mono" w:hAnsi="Roboto Mono"/>
+          <w:color w:val="188038"/>
+          <w:rtl w:val="0"/>
+        </w:rPr>
+        <w:t xml:space="preserve">pm25_roll_mean_7</w:t>
+      </w:r>
+      <w:r>
+        <w:rPr>
+          <w:rtl w:val="0"/>
+        </w:rPr>
+        <w:t xml:space="preserve"> </w:t>
+      </w:r>
+      <w:r>
+        <w:rPr>
+          <w:rtl w:val="0"/>
+        </w:rPr>
+        <w:t xml:space="preserve">(≈14.8) and </w:t>
+      </w:r>
+      <w:r>
+        <w:rPr>
+          <w:rFonts w:ascii="Roboto Mono" w:cs="Roboto Mono" w:eastAsia="Roboto Mono" w:hAnsi="Roboto Mono"/>
+          <w:color w:val="188038"/>
+          <w:rtl w:val="0"/>
+        </w:rPr>
+        <w:t xml:space="preserve">aqi_today</w:t>
+      </w:r>
+      <w:r>
+        <w:rPr>
+          <w:rtl w:val="0"/>
+        </w:rPr>
+        <w:t xml:space="preserve"> </w:t>
+      </w:r>
+      <w:r>
+        <w:rPr>
+          <w:rtl w:val="0"/>
+        </w:rPr>
+        <w:t xml:space="preserve">(≈9.0) dominate; </w:t>
+      </w:r>
+      <w:r>
+        <w:rPr>
+          <w:rFonts w:ascii="Roboto Mono" w:cs="Roboto Mono" w:eastAsia="Roboto Mono" w:hAnsi="Roboto Mono"/>
+          <w:color w:val="188038"/>
+          <w:rtl w:val="0"/>
+        </w:rPr>
+        <w:t xml:space="preserve">pm25_lag_2</w:t>
+      </w:r>
+      <w:r>
+        <w:rPr>
+          <w:rtl w:val="0"/>
+        </w:rPr>
+        <w:t xml:space="preserve"> </w:t>
+      </w:r>
+      <w:r>
+        <w:rPr>
+          <w:rtl w:val="0"/>
+        </w:rPr>
+        <w:t xml:space="preserve">and </w:t>
+      </w:r>
+      <w:r>
+        <w:rPr>
+          <w:rFonts w:ascii="Roboto Mono" w:cs="Roboto Mono" w:eastAsia="Roboto Mono" w:hAnsi="Roboto Mono"/>
+          <w:color w:val="188038"/>
+          <w:rtl w:val="0"/>
+        </w:rPr>
+        <w:t xml:space="preserve">pm10_roll_mean_7</w:t>
+      </w:r>
+      <w:r>
+        <w:rPr>
+          <w:rtl w:val="0"/>
+        </w:rPr>
+        <w:t xml:space="preserve"> </w:t>
+      </w:r>
+      <w:r>
+        <w:rPr>
+          <w:rtl w:val="0"/>
+        </w:rPr>
+        <w:t xml:space="preserve">form the next tier.</w:t>
       </w:r>
     </w:p>
     <w:p>
@@ -4147,7 +4628,118 @@
         <w:rPr>
           <w:rtl w:val="0"/>
         </w:rPr>
-        <w:t xml:space="preserve">The backend is a FastAPI application, structured as an app package with a services layer (feature_service, model_service, prediction_service), a routes layer (the prediction route), and a schemas layer (the prediction schema). FastAPI was chosen over Flask, which the brief also permitted, for its async support, Pydantic-based request/response validation, and automatically generated API documentation. The backend and frontend communicate via environment-variable-configured URLs rather than hardcoded local defaults, and the backend is started via a single project-root entry point.</w:t>
+        <w:t xml:space="preserve">The backend is a FastAPI application, structured as an app package with a services layer (</w:t>
+      </w:r>
+      <w:r>
+        <w:rPr>
+          <w:rFonts w:ascii="Roboto Mono" w:cs="Roboto Mono" w:eastAsia="Roboto Mono" w:hAnsi="Roboto Mono"/>
+          <w:color w:val="188038"/>
+          <w:rtl w:val="0"/>
+        </w:rPr>
+        <w:t xml:space="preserve">feature_service</w:t>
+      </w:r>
+      <w:r>
+        <w:rPr>
+          <w:rtl w:val="0"/>
+        </w:rPr>
+        <w:t xml:space="preserve">, </w:t>
+      </w:r>
+      <w:r>
+        <w:rPr>
+          <w:rFonts w:ascii="Roboto Mono" w:cs="Roboto Mono" w:eastAsia="Roboto Mono" w:hAnsi="Roboto Mono"/>
+          <w:color w:val="188038"/>
+          <w:rtl w:val="0"/>
+        </w:rPr>
+        <w:t xml:space="preserve">model_service</w:t>
+      </w:r>
+      <w:r>
+        <w:rPr>
+          <w:rFonts w:ascii="Roboto" w:cs="Roboto" w:eastAsia="Roboto" w:hAnsi="Roboto"/>
+          <w:color w:val="188038"/>
+          <w:rtl w:val="0"/>
+        </w:rPr>
+        <w:t xml:space="preserve">,</w:t>
+      </w:r>
+      <w:r>
+        <w:rPr>
+          <w:rtl w:val="0"/>
+        </w:rPr>
+        <w:t xml:space="preserve"> </w:t>
+      </w:r>
+      <w:r>
+        <w:rPr>
+          <w:rFonts w:ascii="Roboto Mono" w:cs="Roboto Mono" w:eastAsia="Roboto Mono" w:hAnsi="Roboto Mono"/>
+          <w:color w:val="188038"/>
+          <w:rtl w:val="0"/>
+        </w:rPr>
+        <w:t xml:space="preserve">prediction_service</w:t>
+      </w:r>
+      <w:r>
+        <w:rPr>
+          <w:rtl w:val="0"/>
+        </w:rPr>
+        <w:t xml:space="preserve">), a routes layer (the prediction route), and a schemas layer (the </w:t>
+      </w:r>
+      <w:r>
+        <w:rPr>
+          <w:rFonts w:ascii="Roboto Mono" w:cs="Roboto Mono" w:eastAsia="Roboto Mono" w:hAnsi="Roboto Mono"/>
+          <w:color w:val="188038"/>
+          <w:rtl w:val="0"/>
+        </w:rPr>
+        <w:t xml:space="preserve">prediction</w:t>
+      </w:r>
+      <w:r>
+        <w:rPr>
+          <w:color w:val="188038"/>
+          <w:rtl w:val="0"/>
+        </w:rPr>
+        <w:t xml:space="preserve"> </w:t>
+      </w:r>
+      <w:r>
+        <w:rPr>
+          <w:rtl w:val="0"/>
+        </w:rPr>
+        <w:t xml:space="preserve">schema). FastAPI was chosen over Flask, which the brief also permitted, for its async support, Pydantic-based request/response validation, and automatically generated API documentation. The backend and frontend communicate via environment-variable-configured URLs rather than hardcoded local defaults, and the backend is started via a single project-root entry point. </w:t>
+      </w:r>
+    </w:p>
+    <w:p>
+      <w:pPr>
+        <w:spacing w:after="160" w:lineRule="auto"/>
+        <w:rPr/>
+      </w:pPr>
+      <w:r>
+        <w:rPr>
+          <w:rtl w:val="0"/>
+        </w:rPr>
+        <w:t xml:space="preserve">Two additional endpoints, </w:t>
+      </w:r>
+      <w:r>
+        <w:rPr>
+          <w:rFonts w:ascii="Roboto Mono" w:cs="Roboto Mono" w:eastAsia="Roboto Mono" w:hAnsi="Roboto Mono"/>
+          <w:color w:val="188038"/>
+          <w:rtl w:val="0"/>
+        </w:rPr>
+        <w:t xml:space="preserve">current_air_quality</w:t>
+      </w:r>
+      <w:r>
+        <w:rPr>
+          <w:rtl w:val="0"/>
+        </w:rPr>
+        <w:t xml:space="preserve"> and </w:t>
+      </w:r>
+      <w:r>
+        <w:rPr>
+          <w:rFonts w:ascii="Roboto Mono" w:cs="Roboto Mono" w:eastAsia="Roboto Mono" w:hAnsi="Roboto Mono"/>
+          <w:color w:val="188038"/>
+          <w:rtl w:val="0"/>
+        </w:rPr>
+        <w:t xml:space="preserve">current_weather</w:t>
+      </w:r>
+      <w:r>
+        <w:rPr>
+          <w:rtl w:val="0"/>
+        </w:rPr>
+        <w:t xml:space="preserve">, were later added following the same services/routes/schemas structure, serving the dashboard's Statistics page. </w:t>
       </w:r>
     </w:p>
     <w:p>
@@ -4172,7 +4764,61 @@
         <w:rPr>
           <w:rtl w:val="0"/>
         </w:rPr>
-        <w:t xml:space="preserve">The frontend is built with Vite, TypeScript, and React (React Compiler enabled), using npm and oxlint. React was chosen over Streamlit or Gradio — both permitted by the brief — for full design control over a custom visual identity, since a templated dashboard framework would not support the design goals below.</w:t>
+        <w:t xml:space="preserve">The frontend is built with Vite, TypeScript, and React (React Compiler enabled), using </w:t>
+      </w:r>
+      <w:r>
+        <w:rPr>
+          <w:rFonts w:ascii="Roboto Mono" w:cs="Roboto Mono" w:eastAsia="Roboto Mono" w:hAnsi="Roboto Mono"/>
+          <w:color w:val="188038"/>
+          <w:rtl w:val="0"/>
+        </w:rPr>
+        <w:t xml:space="preserve">npm</w:t>
+      </w:r>
+      <w:r>
+        <w:rPr>
+          <w:rtl w:val="0"/>
+        </w:rPr>
+        <w:t xml:space="preserve"> and </w:t>
+      </w:r>
+      <w:r>
+        <w:rPr>
+          <w:rFonts w:ascii="Roboto Mono" w:cs="Roboto Mono" w:eastAsia="Roboto Mono" w:hAnsi="Roboto Mono"/>
+          <w:color w:val="188038"/>
+          <w:rtl w:val="0"/>
+        </w:rPr>
+        <w:t xml:space="preserve">oxlint</w:t>
+      </w:r>
+      <w:r>
+        <w:rPr>
+          <w:rtl w:val="0"/>
+        </w:rPr>
+        <w:t xml:space="preserve">. React was chosen over Streamlit or Gradio — both permitted by the brief — for full design control over a custom visual identity, since a templated dashboard framework would not support the design goals below.</w:t>
+      </w:r>
+    </w:p>
+    <w:p>
+      <w:pPr>
+        <w:spacing w:after="160" w:lineRule="auto"/>
+        <w:rPr/>
+      </w:pPr>
+      <w:r>
+        <w:rPr>
+          <w:rtl w:val="0"/>
+        </w:rPr>
+        <w:t xml:space="preserve">The frontend was later restructured around </w:t>
+      </w:r>
+      <w:r>
+        <w:rPr>
+          <w:rFonts w:ascii="Roboto Mono" w:cs="Roboto Mono" w:eastAsia="Roboto Mono" w:hAnsi="Roboto Mono"/>
+          <w:color w:val="188038"/>
+          <w:rtl w:val="0"/>
+        </w:rPr>
+        <w:t xml:space="preserve">react-router-dom</w:t>
+      </w:r>
+      <w:r>
+        <w:rPr>
+          <w:rtl w:val="0"/>
+        </w:rPr>
+        <w:t xml:space="preserve"> to support multiple pages: a Prediction page (the original forecast dashboard) and a Statistics page, showing live current AQI, today's prediction, per-pollutant readings, and current weather conditions, each timestamped. </w:t>
       </w:r>
     </w:p>
     <w:p>
@@ -4259,7 +4905,21 @@
         <w:rPr>
           <w:rtl w:val="0"/>
         </w:rPr>
-        <w:t xml:space="preserve">Duplicated environment-setup logic across the growing set of workflow files was consolidated into two GitHub Actions composite actions: setup-python-env (checkout, Python setup, dependency installation) and run-pipeline (running a named script with the required secrets and environment configured).</w:t>
+        <w:t xml:space="preserve">Duplicated environment-setup logic across the growing set of workflow files was consolidated into two GitHub Actions composite actions: </w:t>
+      </w:r>
+      <w:r>
+        <w:rPr>
+          <w:rFonts w:ascii="Roboto Mono" w:cs="Roboto Mono" w:eastAsia="Roboto Mono" w:hAnsi="Roboto Mono"/>
+          <w:color w:val="188038"/>
+          <w:rtl w:val="0"/>
+        </w:rPr>
+        <w:t xml:space="preserve">setup-python-env</w:t>
+      </w:r>
+      <w:r>
+        <w:rPr>
+          <w:rtl w:val="0"/>
+        </w:rPr>
+        <w:t xml:space="preserve"> (checkout, Python setup, dependency installation) and run-pipeline (running a named script with the required secrets and environment configured).</w:t>
       </w:r>
     </w:p>
     <w:p>
@@ -4285,6 +4945,115 @@
           <w:rtl w:val="0"/>
         </w:rPr>
         <w:t xml:space="preserve">Partway through development, the combination of hourly ingestion and multiple recovery pipelines was found to be consuming Hopsworks' free-tier compute quota faster than anticipated — approximately 80% of the monthly allowance used before the month was over. Rather than risk exhausting the quota mid-project, all automated workflows were intentionally paused. During the pause, every pipeline was run and verified manually, and both feature stores were kept current through manual backfill rather than scheduled automation. Automation is re-enabled for submission, so the full scheduled pipeline runs live for evaluation. This was a deliberate resource-management decision made under a real constraint, not a gap left unaddressed.</w:t>
+      </w:r>
+    </w:p>
+    <w:p>
+      <w:pPr>
+        <w:pStyle w:val="Heading2"/>
+        <w:spacing w:after="150" w:before="300" w:lineRule="auto"/>
+        <w:rPr/>
+      </w:pPr>
+      <w:bookmarkStart w:colFirst="0" w:colLast="0" w:name="_ip2nkcxahky8" w:id="0"/>
+      <w:bookmarkEnd w:id="0"/>
+      <w:r>
+        <w:rPr>
+          <w:rtl w:val="0"/>
+        </w:rPr>
+        <w:t xml:space="preserve">7.2 Deployment </w:t>
+      </w:r>
+    </w:p>
+    <w:p>
+      <w:pPr>
+        <w:spacing w:after="160" w:lineRule="auto"/>
+        <w:rPr/>
+      </w:pPr>
+      <w:r>
+        <w:rPr>
+          <w:rtl w:val="0"/>
+        </w:rPr>
+        <w:t xml:space="preserve">The frontend was deployed to Vercel, with the project's root directory set to </w:t>
+      </w:r>
+      <w:r>
+        <w:rPr>
+          <w:rFonts w:ascii="Roboto Mono" w:cs="Roboto Mono" w:eastAsia="Roboto Mono" w:hAnsi="Roboto Mono"/>
+          <w:color w:val="188038"/>
+          <w:rtl w:val="0"/>
+        </w:rPr>
+        <w:t xml:space="preserve">frontend/</w:t>
+      </w:r>
+      <w:r>
+        <w:rPr>
+          <w:rtl w:val="0"/>
+        </w:rPr>
+        <w:t xml:space="preserve"> to support the monorepo layout. The backend was deployed to FastAPI Cloud, the official hosting platform from the FastAPI maintainers, selected after two alternatives were ruled out: Hugging Face Spaces' Docker SDK, found to now require a paid billing account with no free tier available, and Render, whose signup required card verification with no accepted payment method available.</w:t>
+      </w:r>
+    </w:p>
+    <w:p>
+      <w:pPr>
+        <w:spacing w:after="240" w:before="240" w:lineRule="auto"/>
+        <w:rPr/>
+      </w:pPr>
+      <w:r>
+        <w:rPr>
+          <w:rtl w:val="0"/>
+        </w:rPr>
+        <w:t xml:space="preserve">Since FastAPI Cloud resolves dependencies via </w:t>
+      </w:r>
+      <w:r>
+        <w:rPr>
+          <w:rFonts w:ascii="Roboto Mono" w:cs="Roboto Mono" w:eastAsia="Roboto Mono" w:hAnsi="Roboto Mono"/>
+          <w:color w:val="188038"/>
+          <w:rtl w:val="0"/>
+        </w:rPr>
+        <w:t xml:space="preserve">uv</w:t>
+      </w:r>
+      <w:r>
+        <w:rPr>
+          <w:rtl w:val="0"/>
+        </w:rPr>
+        <w:t xml:space="preserve"> rather than pip, a separate </w:t>
+      </w:r>
+      <w:r>
+        <w:rPr>
+          <w:rFonts w:ascii="Roboto Mono" w:cs="Roboto Mono" w:eastAsia="Roboto Mono" w:hAnsi="Roboto Mono"/>
+          <w:color w:val="188038"/>
+          <w:rtl w:val="0"/>
+        </w:rPr>
+        <w:t xml:space="preserve">pyproject.toml</w:t>
+      </w:r>
+      <w:r>
+        <w:rPr>
+          <w:rtl w:val="0"/>
+        </w:rPr>
+        <w:t xml:space="preserve"> and </w:t>
+      </w:r>
+      <w:r>
+        <w:rPr>
+          <w:rFonts w:ascii="Roboto Mono" w:cs="Roboto Mono" w:eastAsia="Roboto Mono" w:hAnsi="Roboto Mono"/>
+          <w:color w:val="188038"/>
+          <w:rtl w:val="0"/>
+        </w:rPr>
+        <w:t xml:space="preserve">uv.lock</w:t>
+      </w:r>
+      <w:r>
+        <w:rPr>
+          <w:rtl w:val="0"/>
+        </w:rPr>
+        <w:t xml:space="preserve"> were introduced specifically for this deployment target, while </w:t>
+      </w:r>
+      <w:r>
+        <w:rPr>
+          <w:rFonts w:ascii="Roboto Mono" w:cs="Roboto Mono" w:eastAsia="Roboto Mono" w:hAnsi="Roboto Mono"/>
+          <w:color w:val="188038"/>
+          <w:rtl w:val="0"/>
+        </w:rPr>
+        <w:t xml:space="preserve">requirements.txt</w:t>
+      </w:r>
+      <w:r>
+        <w:rPr>
+          <w:rtl w:val="0"/>
+        </w:rPr>
+        <w:t xml:space="preserve"> remains the source of truth for local development and all GitHub Actions pipelines.</w:t>
       </w:r>
     </w:p>
     <w:p>
@@ -4464,7 +5233,43 @@
           <w:vertAlign w:val="baseline"/>
           <w:rtl w:val="0"/>
         </w:rPr>
-        <w:t xml:space="preserve">On Windows, hopsworks.login() failed due to Linux-specific certificate paths used internally by the SDK; resolved with a custom Windows-compatible certificate folder. A related issue from hardcoded /tmp paths during feature insertion was resolved by patching the installed SDK to use a valid temporary directory.</w:t>
+        <w:t xml:space="preserve">On Windows, </w:t>
+      </w:r>
+      <w:r>
+        <w:rPr>
+          <w:rFonts w:ascii="Roboto Mono" w:cs="Roboto Mono" w:eastAsia="Roboto Mono" w:hAnsi="Roboto Mono"/>
+          <w:i w:val="0"/>
+          <w:iCs w:val="0"/>
+          <w:smallCaps w:val="0"/>
+          <w:strike w:val="0"/>
+          <w:color w:val="188038"/>
+          <w:sz w:val="22"/>
+          <w:szCs w:val="22"/>
+          <w:u w:val="none"/>
+          <w:shd w:fill="auto" w:val="clear"/>
+          <w:vertAlign w:val="baseline"/>
+          <w:rtl w:val="0"/>
+        </w:rPr>
+        <w:t xml:space="preserve">hopsworks.login()</w:t>
+      </w:r>
+      <w:r>
+        <w:rPr>
+          <w:rFonts w:ascii="Calibri" w:cs="Calibri" w:eastAsia="Calibri" w:hAnsi="Calibri"/>
+          <w:b w:val="0"/>
+          <w:bCs w:val="0"/>
+          <w:i w:val="0"/>
+          <w:iCs w:val="0"/>
+          <w:smallCaps w:val="0"/>
+          <w:strike w:val="0"/>
+          <w:color w:val="000000"/>
+          <w:sz w:val="22"/>
+          <w:szCs w:val="22"/>
+          <w:u w:val="none"/>
+          <w:shd w:fill="auto" w:val="clear"/>
+          <w:vertAlign w:val="baseline"/>
+          <w:rtl w:val="0"/>
+        </w:rPr>
+        <w:t xml:space="preserve"> failed due to Linux-specific certificate paths used internally by the SDK; resolved with a custom Windows-compatible certificate folder. A related issue from hardcoded /tmp paths during feature insertion was resolved by patching the installed SDK to use a valid temporary directory.</w:t>
       </w:r>
     </w:p>
     <w:p>
@@ -4523,7 +5328,110 @@
         <w:rPr>
           <w:rtl w:val="0"/>
         </w:rPr>
-        <w:t xml:space="preserve">Hopsworks pins an older protobuf version than TensorFlow requires. This conflict never surfaced locally, since the working local environment was never fully re-resolved from a clean state — but GitHub Actions' clean installs hit it every time, with pip's resolver refusing to install both together. Resolved by installing Hopsworks separately with --no-deps after the rest of requirements.txt, so protobuf resolves against TensorFlow's requirement first, and Hopsworks is layered on top without pip re-checking its own declared constraint.</w:t>
+        <w:t xml:space="preserve">Hopsworks pins an older protobuf version than TensorFlow requires. This conflict never surfaced locally, since the working local environment was never fully re-resolved from a clean state — but GitHub Actions' clean installs hit it every time, with pip's resolver refusing to install both together. Resolved by installing Hopsworks separately with </w:t>
+      </w:r>
+      <w:r>
+        <w:rPr>
+          <w:rFonts w:ascii="Roboto Mono" w:cs="Roboto Mono" w:eastAsia="Roboto Mono" w:hAnsi="Roboto Mono"/>
+          <w:color w:val="188038"/>
+          <w:rtl w:val="0"/>
+        </w:rPr>
+        <w:t xml:space="preserve">--no-deps</w:t>
+      </w:r>
+      <w:r>
+        <w:rPr>
+          <w:rtl w:val="0"/>
+        </w:rPr>
+        <w:t xml:space="preserve"> after the rest of </w:t>
+      </w:r>
+      <w:r>
+        <w:rPr>
+          <w:rFonts w:ascii="Roboto Mono" w:cs="Roboto Mono" w:eastAsia="Roboto Mono" w:hAnsi="Roboto Mono"/>
+          <w:color w:val="188038"/>
+          <w:rtl w:val="0"/>
+        </w:rPr>
+        <w:t xml:space="preserve">requirements.txt</w:t>
+      </w:r>
+      <w:r>
+        <w:rPr>
+          <w:rtl w:val="0"/>
+        </w:rPr>
+        <w:t xml:space="preserve">, so protobuf resolves against TensorFlow's requirement first, and Hopsworks is layered on top without pip re-checking its own declared constraint.</w:t>
+      </w:r>
+    </w:p>
+    <w:p>
+      <w:pPr>
+        <w:numPr>
+          <w:ilvl w:val="0"/>
+          <w:numId w:val="1"/>
+        </w:numPr>
+        <w:spacing w:after="80" w:lineRule="auto"/>
+        <w:ind w:left="720" w:hanging="360"/>
+        <w:rPr>
+          <w:u w:val="none"/>
+        </w:rPr>
+      </w:pPr>
+      <w:r>
+        <w:rPr>
+          <w:rtl w:val="0"/>
+        </w:rPr>
+        <w:t xml:space="preserve">The same protobuf conflict recurred under </w:t>
+      </w:r>
+      <w:r>
+        <w:rPr>
+          <w:rFonts w:ascii="Roboto Mono" w:cs="Roboto Mono" w:eastAsia="Roboto Mono" w:hAnsi="Roboto Mono"/>
+          <w:color w:val="188038"/>
+          <w:rtl w:val="0"/>
+        </w:rPr>
+        <w:t xml:space="preserve">uv</w:t>
+      </w:r>
+      <w:r>
+        <w:rPr>
+          <w:rtl w:val="0"/>
+        </w:rPr>
+        <w:t xml:space="preserve">-based dependency resolution for the FastAPI Cloud deployment target, where </w:t>
+      </w:r>
+      <w:r>
+        <w:rPr>
+          <w:rFonts w:ascii="Roboto Mono" w:cs="Roboto Mono" w:eastAsia="Roboto Mono" w:hAnsi="Roboto Mono"/>
+          <w:color w:val="188038"/>
+          <w:rtl w:val="0"/>
+        </w:rPr>
+        <w:t xml:space="preserve">--no-deps</w:t>
+      </w:r>
+      <w:r>
+        <w:rPr>
+          <w:rtl w:val="0"/>
+        </w:rPr>
+        <w:t xml:space="preserve"> has no direct equivalent. Resolved using </w:t>
+      </w:r>
+      <w:r>
+        <w:rPr>
+          <w:rFonts w:ascii="Roboto Mono" w:cs="Roboto Mono" w:eastAsia="Roboto Mono" w:hAnsi="Roboto Mono"/>
+          <w:color w:val="188038"/>
+          <w:rtl w:val="0"/>
+        </w:rPr>
+        <w:t xml:space="preserve">uv</w:t>
+      </w:r>
+      <w:r>
+        <w:rPr>
+          <w:rtl w:val="0"/>
+        </w:rPr>
+        <w:t xml:space="preserve">'s </w:t>
+      </w:r>
+      <w:r>
+        <w:rPr>
+          <w:rFonts w:ascii="Roboto Mono" w:cs="Roboto Mono" w:eastAsia="Roboto Mono" w:hAnsi="Roboto Mono"/>
+          <w:color w:val="188038"/>
+          <w:rtl w:val="0"/>
+        </w:rPr>
+        <w:t xml:space="preserve">dependency-metadata</w:t>
+      </w:r>
+      <w:r>
+        <w:rPr>
+          <w:rtl w:val="0"/>
+        </w:rPr>
+        <w:t xml:space="preserve"> override to declare Hopsworks' own dependency list as empty, forcing protobuf to resolve against TensorFlow's requirement instead, matching the same effect as the pip approach. </w:t>
       </w:r>
     </w:p>
     <w:p>
@@ -4548,7 +5456,7 @@
         <w:rPr>
           <w:rtl w:val="0"/>
         </w:rPr>
-        <w:t xml:space="preserve">The completed system meets the internship brief's core requirements: a fully serverless, automated pipeline; a statistical-versus-deep-learning model comparison (Random Forest and Ridge Regression against a Dense Neural Network); SHAP-based explainability per forecast horizon; a hazardous-AQI alerting mechanism built into the dashboard; and a working web application. The final per-horizon MLP configuration reaches an R² of 0.901 on Day 1, with Days 2–4 in the 0.51–0.59 range — reported honestly as the genuine difficulty ceiling of multi-day air quality forecasting on the available data volume, rather than adjusted to look stronger than it is.</w:t>
+        <w:t xml:space="preserve">The completed system meets the internship brief's core requirements: a fully serverless, automated pipeline; a statistical-versus-deep-learning model comparison (Random Forest and Ridge Regression against a Dense Neural Network); SHAP-based explainability per forecast horizon; a hazardous-AQI alerting mechanism built into the dashboard; and a working web application. The final per-horizon MLP configuration reaches an R² of 0.901 on Day 1, with Days 2–4 in the 0.51–0.59 range — reported honestly as the genuine difficulty ceiling of multi-day air quality forecasting on the available data volume, rather than adjusted to look stronger than it is. Both the frontend and backend are deployed and live for evaluation. </w:t>
       </w:r>
     </w:p>
     <w:p>
@@ -4648,49 +5556,6 @@
           <w:rtl w:val="0"/>
         </w:rPr>
         <w:t xml:space="preserve">Forecast accuracy declines with horizon length (Day 1 R² of 0.901 versus 0.51–0.59 for Days 2–4), a genuine characteristic of the forecasting problem rather than an oversight.</w:t>
-      </w:r>
-    </w:p>
-    <w:p>
-      <w:pPr>
-        <w:keepNext w:val="0"/>
-        <w:keepLines w:val="0"/>
-        <w:pageBreakBefore w:val="0"/>
-        <w:widowControl w:val="1"/>
-        <w:numPr>
-          <w:ilvl w:val="0"/>
-          <w:numId w:val="1"/>
-        </w:numPr>
-        <w:pBdr>
-          <w:top w:space="0" w:sz="0" w:val="nil"/>
-          <w:left w:space="0" w:sz="0" w:val="nil"/>
-          <w:bottom w:space="0" w:sz="0" w:val="nil"/>
-          <w:right w:space="0" w:sz="0" w:val="nil"/>
-          <w:between w:space="0" w:sz="0" w:val="nil"/>
-        </w:pBdr>
-        <w:shd w:fill="auto" w:val="clear"/>
-        <w:spacing w:after="80" w:before="0" w:line="240" w:lineRule="auto"/>
-        <w:ind w:left="720" w:right="0" w:hanging="360"/>
-        <w:jc w:val="left"/>
-        <w:rPr/>
-      </w:pPr>
-      <w:r>
-        <w:rPr>
-          <w:rFonts w:ascii="Calibri" w:cs="Calibri" w:eastAsia="Calibri" w:hAnsi="Calibri"/>
-          <w:b w:val="0"/>
-          <w:bCs w:val="0"/>
-          <w:i w:val="0"/>
-          <w:iCs w:val="0"/>
-          <w:smallCaps w:val="0"/>
-          <w:strike w:val="0"/>
-          <w:color w:val="000000"/>
-          <w:sz w:val="22"/>
-          <w:szCs w:val="22"/>
-          <w:u w:val="none"/>
-          <w:shd w:fill="auto" w:val="clear"/>
-          <w:vertAlign w:val="baseline"/>
-          <w:rtl w:val="0"/>
-        </w:rPr>
-        <w:t xml:space="preserve">A Stats page is scoped in the dashboard's navigation but not yet built.</w:t>
       </w:r>
     </w:p>
     <w:p>

</xml_diff>

<commit_message>
docs: update project documentation
</commit_message>
<xml_diff>
--- a/docs/documentation.docx
+++ b/docs/documentation.docx
@@ -177,7 +177,7 @@
     </w:p>
     <w:sdt>
       <w:sdtPr>
-        <w:id w:val="-23899407"/>
+        <w:id w:val="142832268"/>
         <w:docPartObj>
           <w:docPartGallery w:val="Table of Contents"/>
           <w:docPartUnique w:val="1"/>
@@ -4744,6 +4744,60 @@
     </w:p>
     <w:p>
       <w:pPr>
+        <w:spacing w:after="160" w:lineRule="auto"/>
+        <w:rPr/>
+      </w:pPr>
+      <w:r>
+        <w:rPr>
+          <w:rtl w:val="0"/>
+        </w:rPr>
+        <w:t xml:space="preserve">Two further route groups were added later: raw and engineered historical backfill (</w:t>
+      </w:r>
+      <w:r>
+        <w:rPr>
+          <w:rFonts w:ascii="Roboto Mono" w:cs="Roboto Mono" w:eastAsia="Roboto Mono" w:hAnsi="Roboto Mono"/>
+          <w:color w:val="188038"/>
+          <w:rtl w:val="0"/>
+        </w:rPr>
+        <w:t xml:space="preserve">raw_historical_backfill</w:t>
+      </w:r>
+      <w:r>
+        <w:rPr>
+          <w:rtl w:val="0"/>
+        </w:rPr>
+        <w:t xml:space="preserve">, </w:t>
+      </w:r>
+      <w:r>
+        <w:rPr>
+          <w:rFonts w:ascii="Roboto Mono" w:cs="Roboto Mono" w:eastAsia="Roboto Mono" w:hAnsi="Roboto Mono"/>
+          <w:color w:val="188038"/>
+          <w:rtl w:val="0"/>
+        </w:rPr>
+        <w:t xml:space="preserve">engineered_historical_backfill</w:t>
+      </w:r>
+      <w:r>
+        <w:rPr>
+          <w:rtl w:val="0"/>
+        </w:rPr>
+        <w:t xml:space="preserve">), which bring the two Hopsworks feature stores up to date on demand rather than relying solely on scheduled automation, and </w:t>
+      </w:r>
+      <w:r>
+        <w:rPr>
+          <w:rFonts w:ascii="Roboto Mono" w:cs="Roboto Mono" w:eastAsia="Roboto Mono" w:hAnsi="Roboto Mono"/>
+          <w:color w:val="188038"/>
+          <w:rtl w:val="0"/>
+        </w:rPr>
+        <w:t xml:space="preserve">model_training</w:t>
+      </w:r>
+      <w:r>
+        <w:rPr>
+          <w:rtl w:val="0"/>
+        </w:rPr>
+        <w:t xml:space="preserve">, which triggers a retrain against the latest available data. The two backfill routes share a common request/response schema and a dedicated utils module for shared backfill logic and route-level error handling. Each determines its working date range by reading the latest stored timestamp from the relevant feature store and backfilling from there to the current date (raw) or the current date minus one day (engineered) — the two routes intentionally use different end-date logic, reflecting the different granularity of each store.</w:t>
+      </w:r>
+    </w:p>
+    <w:p>
+      <w:pPr>
         <w:pStyle w:val="Heading2"/>
         <w:spacing w:after="150" w:before="300" w:lineRule="auto"/>
         <w:rPr/>
@@ -4818,7 +4872,19 @@
         <w:rPr>
           <w:rtl w:val="0"/>
         </w:rPr>
-        <w:t xml:space="preserve"> to support multiple pages: a Prediction page (the original forecast dashboard) and a Statistics page, showing live current AQI, today's prediction, per-pollutant readings, and current weather conditions, each timestamped. </w:t>
+        <w:t xml:space="preserve"> to support multiple pages: a Prediction page (the original forecast dashboard) and a Statistics page, showing live current AQI, today's prediction, per-pollutant readings, and current weather conditions, each timestamped.</w:t>
+      </w:r>
+    </w:p>
+    <w:p>
+      <w:pPr>
+        <w:spacing w:after="160" w:lineRule="auto"/>
+        <w:rPr/>
+      </w:pPr>
+      <w:r>
+        <w:rPr>
+          <w:rtl w:val="0"/>
+        </w:rPr>
+        <w:t xml:space="preserve">A third page, Backfill, was added to let the user trigger an on-demand data recovery and model retrain directly from the dashboard when the feature stores or predictions are behind. Its interface centers on a single action button — floating continuously, glowing on hover — paired with a progress bar using the same aurora color treatment as the background, showing live percentage progress and state text that fades between stages (raw backfill → engineered backfill → model training → complete). The Prediction and Statistics pages were each updated to detect stale prediction data and surface a notification card with a direct link to the Backfill page instead of silently showing outdated numbers.</w:t>
       </w:r>
     </w:p>
     <w:p>
@@ -5054,6 +5120,32 @@
           <w:rtl w:val="0"/>
         </w:rPr>
         <w:t xml:space="preserve"> remains the source of truth for local development and all GitHub Actions pipelines.</w:t>
+      </w:r>
+    </w:p>
+    <w:p>
+      <w:pPr>
+        <w:spacing w:after="240" w:before="240" w:lineRule="auto"/>
+        <w:rPr/>
+      </w:pPr>
+      <w:r>
+        <w:rPr>
+          <w:rtl w:val="0"/>
+        </w:rPr>
+        <w:t xml:space="preserve">A </w:t>
+      </w:r>
+      <w:r>
+        <w:rPr>
+          <w:rFonts w:ascii="Roboto Mono" w:cs="Roboto Mono" w:eastAsia="Roboto Mono" w:hAnsi="Roboto Mono"/>
+          <w:color w:val="188038"/>
+          <w:rtl w:val="0"/>
+        </w:rPr>
+        <w:t xml:space="preserve">vercel.json</w:t>
+      </w:r>
+      <w:r>
+        <w:rPr>
+          <w:rtl w:val="0"/>
+        </w:rPr>
+        <w:t xml:space="preserve"> was added at the frontend root after React Router routes returned 404 on direct navigation/refresh under Vercel's default routing.</w:t>
       </w:r>
     </w:p>
     <w:p>
@@ -5456,7 +5548,7 @@
         <w:rPr>
           <w:rtl w:val="0"/>
         </w:rPr>
-        <w:t xml:space="preserve">The completed system meets the internship brief's core requirements: a fully serverless, automated pipeline; a statistical-versus-deep-learning model comparison (Random Forest and Ridge Regression against a Dense Neural Network); SHAP-based explainability per forecast horizon; a hazardous-AQI alerting mechanism built into the dashboard; and a working web application. The final per-horizon MLP configuration reaches an R² of 0.901 on Day 1, with Days 2–4 in the 0.51–0.59 range — reported honestly as the genuine difficulty ceiling of multi-day air quality forecasting on the available data volume, rather than adjusted to look stronger than it is. Both the frontend and backend are deployed and live for evaluation. </w:t>
+        <w:t xml:space="preserve">The completed system meets the internship brief's core requirements: a fully serverless, automated pipeline — with an on-demand backfill and retrain flow available directly from the dashboard as a supplement to scheduled automation — a statistical-versus-deep-learning model comparison (Random Forest and Ridge Regression against a Dense Neural Network); SHAP-based explainability per forecast horizon; a hazardous-AQI alerting mechanism built into the dashboard; and a working web application. The final per-horizon MLP configuration reaches an R² of 0.901 on Day 1, with Days 2–4 in the 0.51–0.59 range — reported honestly as the genuine difficulty ceiling of multi-day air quality forecasting on the available data volume, rather than adjusted to look stronger than it is. Both the frontend and backend are deployed and live for evaluation. </w:t>
       </w:r>
     </w:p>
     <w:p>

</xml_diff>

<commit_message>
fix: smooth Aurora rendering
</commit_message>
<xml_diff>
--- a/docs/documentation.docx
+++ b/docs/documentation.docx
@@ -177,7 +177,7 @@
     </w:p>
     <w:sdt>
       <w:sdtPr>
-        <w:id w:val="1576257562"/>
+        <w:id w:val="-1808600436"/>
         <w:docPartObj>
           <w:docPartGallery w:val="Table of Contents"/>
           <w:docPartUnique w:val="1"/>
@@ -6756,6 +6756,42 @@
     </w:p>
     <w:p>
       <w:pPr>
+        <w:spacing w:after="160" w:lineRule="auto"/>
+        <w:rPr/>
+      </w:pPr>
+      <w:r>
+        <w:rPr>
+          <w:rtl w:val="0"/>
+        </w:rPr>
+        <w:t xml:space="preserve">A fifth page, City, lets the user search for any city and receive a 4-day AQI prediction for it. The flow geocodes the searched city to latitude/longitude, fetches its 7-day raw feature data from Open-Meteo, converts it into engineered features using the same pipeline used for Lahore, and runs it through the existing per-horizon production models. Since all four production models were trained exclusively on Lahore data, the page displays an explicit notice that predictions for other cities may be less accurate — an honest disclosure rather than presenting out-of-distribution predictions as equally reliable.</w:t>
+      </w:r>
+    </w:p>
+    <w:p>
+      <w:pPr>
+        <w:spacing w:after="160" w:lineRule="auto"/>
+        <w:rPr/>
+      </w:pPr>
+      <w:r>
+        <w:rPr>
+          <w:rtl w:val="0"/>
+        </w:rPr>
+        <w:t xml:space="preserve">A corresponding backend route group, city, was added following the same services/routes/schemas structure, implementing the geocode → raw fetch → engineer → predict flow described above.</w:t>
+      </w:r>
+    </w:p>
+    <w:p>
+      <w:pPr>
+        <w:spacing w:after="160" w:lineRule="auto"/>
+        <w:rPr/>
+      </w:pPr>
+      <w:r>
+        <w:rPr>
+          <w:rtl w:val="0"/>
+        </w:rPr>
+        <w:t xml:space="preserve">Loading skeletons were added for the Prediction, Statistics, Technical Details, and City pages, replacing blank or shifting layouts during data fetches with a proper loading state.</w:t>
+      </w:r>
+    </w:p>
+    <w:p>
+      <w:pPr>
         <w:pStyle w:val="Heading2"/>
         <w:spacing w:after="150" w:before="300" w:lineRule="auto"/>
         <w:rPr/>
@@ -6789,6 +6825,18 @@
           <w:rtl w:val="0"/>
         </w:rPr>
         <w:t xml:space="preserve">Both the Aurora background and the sidebar's ice texture were originally implemented by scaling their SVGs to fill the container; on longer pages (such as Technical Details) this stretched the pattern and distorted the texture. Both were changed to tile/repeat the SVGs instead, keeping consistent texture density regardless of page length.</w:t>
+      </w:r>
+    </w:p>
+    <w:p>
+      <w:pPr>
+        <w:spacing w:after="160" w:lineRule="auto"/>
+        <w:rPr/>
+      </w:pPr>
+      <w:r>
+        <w:rPr>
+          <w:rtl w:val="0"/>
+        </w:rPr>
+        <w:t xml:space="preserve">The first tiling attempt still produced a visible seam at tile boundaries, since the wave illustration is not vertically symmetric (green at the top, magenta at the bottom) — identical repeating tiles always met mismatched colors at the seam, and an initial crossfade attempt made this worse by stacking two half-opacity tiles into a flat, desaturated band. This was resolved by mirroring every other tile vertically instead of crossfading, so adjacent tile edges are guaranteed to match exactly.</w:t>
       </w:r>
     </w:p>
     <w:p>
@@ -7232,6 +7280,11 @@
         </w:rPr>
         <w:t xml:space="preserve">Exception handling in the Open-Meteo response parser originally aborted an entire batch on a single bad hour; changed to skip only the affected hour so a single bad reading does not discard an otherwise-valid batch.</w:t>
       </w:r>
+      <w:r>
+        <w:rPr>
+          <w:rtl w:val="0"/>
+        </w:rPr>
+      </w:r>
     </w:p>
     <w:p>
       <w:pPr>
@@ -7509,7 +7562,43 @@
         <w:rPr>
           <w:rtl w:val="0"/>
         </w:rPr>
-        <w:t xml:space="preserve">The completed system meets the internship brief's core requirements: a fully serverless, automated pipeline — with an on-demand backfill and retrain flow available directly from the dashboard as a supplement to scheduled automation — a statistical-versus-deep-learning model comparison (Random Forest and Ridge Regression against a Dense Neural Network); SHAP-based explainability per forecast horizon; a hazardous-AQI alerting mechanism built into the dashboard; and a working web application. This comparison was subsequently extended per-horizon (Section 4.4) to include XGBoost and LightGBM alongside the original candidates, and production now runs the best-performing model type independently for each of the four forecast days rather than one shared model type. The final per-horizon results reach an R² of 0.898 on Day 1 (XGBoost), 0.659 on Day 2 (MLP), 0.561 on Day 3 (LightGBM), and 0.498 on Day 4 (Random Forest) — reported honestly as the genuine difficulty ceiling of multi-day air quality forecasting on the available data volume, rather than adjusted to look stronger than it is.</w:t>
+        <w:t xml:space="preserve">The completed system meets the internship brief's core requirements: a fully serverless, automated pipeline — with an on-demand backfill and retrain flow available directly from the dashboard as a supplement to scheduled automation — a statistical-versus-deep-learning model comparison (Random Forest and Ridge Regression against a Dense Neural Network); SHAP-based explainability per forecast horizon; a hazardous-AQI alerting mechanism built into the dashboard; and a working web application.</w:t>
+      </w:r>
+    </w:p>
+    <w:p>
+      <w:pPr>
+        <w:spacing w:after="160" w:lineRule="auto"/>
+        <w:rPr/>
+      </w:pPr>
+      <w:r>
+        <w:rPr>
+          <w:rtl w:val="0"/>
+        </w:rPr>
+        <w:t xml:space="preserve">This comparison was subsequently extended per-horizon (Section 4.4) to include XGBoost and LightGBM alongside the original candidates, and production now runs the best-performing model type independently for each of the four forecast days rather than one shared model type. </w:t>
+      </w:r>
+    </w:p>
+    <w:p>
+      <w:pPr>
+        <w:spacing w:after="160" w:lineRule="auto"/>
+        <w:rPr/>
+      </w:pPr>
+      <w:r>
+        <w:rPr>
+          <w:rtl w:val="0"/>
+        </w:rPr>
+        <w:t xml:space="preserve">The final per-horizon results reach an R² of 0.898 on Day 1 (XGBoost), 0.659 on Day 2 (MLP), 0.561 on Day 3 (LightGBM), and 0.498 on Day 4 (Random Forest) — reported honestly as the genuine difficulty ceiling of multi-day air quality forecasting on the available data volume, rather than adjusted to look stronger than it is.</w:t>
+      </w:r>
+    </w:p>
+    <w:p>
+      <w:pPr>
+        <w:spacing w:after="160" w:lineRule="auto"/>
+        <w:rPr/>
+      </w:pPr>
+      <w:r>
+        <w:rPr>
+          <w:rtl w:val="0"/>
+        </w:rPr>
+        <w:t xml:space="preserve">A City page extends predictions beyond Lahore on demand, with an explicit accuracy caveat since the production models were trained on Lahore data only (see Limitations).</w:t>
       </w:r>
     </w:p>
     <w:p>
@@ -7550,22 +7639,14 @@
       </w:pPr>
       <w:r>
         <w:rPr>
-          <w:rFonts w:ascii="Calibri" w:cs="Calibri" w:eastAsia="Calibri" w:hAnsi="Calibri"/>
-          <w:b w:val="0"/>
-          <w:bCs w:val="0"/>
-          <w:i w:val="0"/>
-          <w:iCs w:val="0"/>
-          <w:smallCaps w:val="0"/>
-          <w:strike w:val="0"/>
-          <w:color w:val="000000"/>
-          <w:sz w:val="22"/>
-          <w:szCs w:val="22"/>
-          <w:u w:val="none"/>
-          <w:shd w:fill="auto" w:val="clear"/>
-          <w:vertAlign w:val="baseline"/>
-          <w:rtl w:val="0"/>
-        </w:rPr>
-        <w:t xml:space="preserve">Single city only: the model and feature store currently support Lahore exclusively. A city-selection page is scoped in the dashboard's navigation but not yet built, pending a feasibility check on whether sufficient historical data can be backfilled on demand for an arbitrary new city.</w:t>
+          <w:rtl w:val="0"/>
+        </w:rPr>
+        <w:t xml:space="preserve">Non-Lahore predictions are out-of-distribution: the City page supports arbitrary cities via   on-demand geocoding and feature engineering, but all four production models were trained   exclusively on Lahore data. Predictions for other cities may be meaningfully less accurate, which is disclosed to the user directly on the City page rather than presented without qualification.</w:t>
+      </w:r>
+      <w:r>
+        <w:rPr>
+          <w:rtl w:val="0"/>
+        </w:rPr>
       </w:r>
     </w:p>
     <w:p>
@@ -7668,7 +7749,7 @@
         <w:rPr>
           <w:rtl w:val="0"/>
         </w:rPr>
-        <w:t xml:space="preserve">Aura is a complete, serverless, end-to-end air quality forecasting system for Lahore — spanning automated data ingestion, ...a two-tier feature store, per-horizon models spanning both statistical and deep learning approaches, SHAP-based explainability, and a custom-built dashboard — developed under real constraints, including a data source migration forced by free-tier limitations, a compute quota that required a deliberate pause-and-resume decision, a modeling redesign midway through development once the initial shared-feature-set approach showed clear per-horizon weaknesses, and a further model-type re-evaluation once it became clear that the model type winning Day 1 did not necessarily generalize as the best choice for every horizon.</w:t>
+        <w:t xml:space="preserve">Aura is a complete, serverless, end-to-end air quality forecasting system for Lahore — spanning automated data ingestion, ...a two-tier feature store, per-horizon models spanning both statistical and deep learning approaches, SHAP-based explainability, and a custom-built dashboard — developed under real constraints, including a data source migration forced by free-tier limitations, a compute quota that required a deliberate pause-and-resume decision, a modeling redesign midway through development once the initial shared-feature-set approach showed clear per-horizon weaknesses, a further model-type re-evaluation once it became clear that the model type winning Day 1 did not necessarily generalize as the best choice for every horizon, and an on-demand generalization to arbitrary cities built on top of models trained for one specific location</w:t>
       </w:r>
     </w:p>
     <w:sectPr>

</xml_diff>